<commit_message>
fix: remove sombreamento herdado do template na Fase 2
</commit_message>
<xml_diff>
--- a/Fase 2 - Fundamentos de Sistemas Web - Wilson Oliveira Lima.docx
+++ b/Fase 2 - Fundamentos de Sistemas Web - Wilson Oliveira Lima.docx
@@ -152,862 +152,595 @@
     </w:p>
     <w:p>
       <w:pPr>
-        <w:shd w:val="clear" w:color="auto" w:fill="32966E"/>
         <w:spacing w:after="0" w:line="240" w:lineRule="auto"/>
         <w:jc w:val="both"/>
         <w:rPr>
           <w:rFonts w:asciiTheme="minorHAnsi" w:hAnsiTheme="minorHAnsi" w:cstheme="minorHAnsi"/>
           <w:b/>
           <w:bCs/>
-          <w:color w:val="FFFFFF" w:themeColor="background1"/>
-          <w:spacing w:val="-2"/>
-          <w:sz w:val="20"/>
-          <w:szCs w:val="20"/>
-        </w:rPr>
-      </w:pPr>
-      <w:r>
-        <w:rPr>
-          <w:rStyle w:val="normaltextrun"/>
-          <w:rFonts w:asciiTheme="majorHAnsi" w:hAnsiTheme="majorHAnsi" w:cstheme="majorHAnsi"/>
-          <w:b/>
-          <w:color w:val="FFFFFF" w:themeColor="background1"/>
+          <w:color w:val="4664BE"/>
+          <w:szCs w:val="21"/>
+        </w:rPr>
+      </w:pPr>
+      <w:r>
+        <w:rPr>
+          <w:rFonts w:asciiTheme="minorHAnsi" w:hAnsiTheme="minorHAnsi"/>
+          <w:b/>
+          <w:color w:val="000000" w:themeColor="text1"/>
         </w:rPr>
         <w:t>Recursos implementados na Fase 2</w:t>
       </w:r>
       <w:r>
         <w:rPr>
-          <w:rStyle w:val="normaltextrun"/>
-          <w:rFonts w:asciiTheme="majorHAnsi" w:hAnsiTheme="majorHAnsi" w:cstheme="majorHAnsi"/>
-          <w:b/>
-          <w:color w:val="FFFFFF" w:themeColor="background1"/>
-        </w:rPr>
-      </w:r>
-      <w:r>
-        <w:rPr>
-          <w:rStyle w:val="normaltextrun"/>
-          <w:rFonts w:asciiTheme="majorHAnsi" w:hAnsiTheme="majorHAnsi" w:cstheme="majorHAnsi"/>
-          <w:b/>
-          <w:color w:val="FFFFFF" w:themeColor="background1"/>
-        </w:rPr>
-      </w:r>
-    </w:p>
-    <w:p>
-      <w:pPr>
-        <w:shd w:val="clear" w:color="auto" w:fill="32966E"/>
+          <w:rFonts w:asciiTheme="minorHAnsi" w:hAnsiTheme="minorHAnsi"/>
+          <w:color w:val="000000" w:themeColor="text1"/>
+        </w:rPr>
+      </w:r>
+    </w:p>
+    <w:p>
+      <w:pPr>
         <w:spacing w:after="0" w:line="240" w:lineRule="auto"/>
         <w:jc w:val="both"/>
         <w:rPr>
           <w:rFonts w:asciiTheme="minorHAnsi" w:hAnsiTheme="minorHAnsi" w:cstheme="minorHAnsi"/>
           <w:b/>
           <w:bCs/>
-          <w:color w:val="FFFFFF" w:themeColor="background1"/>
-          <w:spacing w:val="-2"/>
-          <w:sz w:val="20"/>
-          <w:szCs w:val="20"/>
-        </w:rPr>
-      </w:pPr>
-      <w:r>
-        <w:rPr>
-          <w:rStyle w:val="normaltextrun"/>
-          <w:rFonts w:asciiTheme="majorHAnsi" w:hAnsiTheme="majorHAnsi" w:cstheme="majorHAnsi"/>
-          <w:b/>
-          <w:color w:val="FFFFFF" w:themeColor="background1"/>
+          <w:color w:val="4664BE"/>
+          <w:szCs w:val="21"/>
+        </w:rPr>
+      </w:pPr>
+      <w:r>
+        <w:rPr>
+          <w:rFonts w:asciiTheme="minorHAnsi" w:hAnsiTheme="minorHAnsi"/>
+          <w:b/>
+          <w:color w:val="000000" w:themeColor="text1"/>
         </w:rPr>
         <w:t>1. CSS, Bootstrap e carrossel de imagens</w:t>
       </w:r>
       <w:r>
         <w:rPr>
-          <w:rStyle w:val="normaltextrun"/>
-          <w:rFonts w:asciiTheme="majorHAnsi" w:hAnsiTheme="majorHAnsi" w:cstheme="majorHAnsi"/>
-          <w:b/>
-          <w:color w:val="FFFFFF" w:themeColor="background1"/>
-        </w:rPr>
-      </w:r>
-      <w:r>
-        <w:rPr>
-          <w:rStyle w:val="normaltextrun"/>
-          <w:rFonts w:asciiTheme="majorHAnsi" w:hAnsiTheme="majorHAnsi" w:cstheme="majorHAnsi"/>
-          <w:b/>
-          <w:color w:val="FFFFFF" w:themeColor="background1"/>
-        </w:rPr>
-      </w:r>
-    </w:p>
-    <w:p>
-      <w:pPr>
-        <w:shd w:val="clear" w:color="auto" w:fill="32966E"/>
+          <w:rFonts w:asciiTheme="minorHAnsi" w:hAnsiTheme="minorHAnsi"/>
+          <w:color w:val="000000" w:themeColor="text1"/>
+        </w:rPr>
+      </w:r>
+    </w:p>
+    <w:p>
+      <w:pPr>
         <w:spacing w:after="0" w:line="240" w:lineRule="auto"/>
         <w:jc w:val="both"/>
         <w:rPr>
           <w:rFonts w:asciiTheme="minorHAnsi" w:hAnsiTheme="minorHAnsi" w:cstheme="minorHAnsi"/>
           <w:b/>
           <w:bCs/>
-          <w:color w:val="FFFFFF" w:themeColor="background1"/>
-          <w:spacing w:val="-2"/>
-          <w:sz w:val="20"/>
-          <w:szCs w:val="20"/>
-        </w:rPr>
-      </w:pPr>
-      <w:r>
-        <w:rPr>
-          <w:rStyle w:val="normaltextrun"/>
-          <w:rFonts w:asciiTheme="majorHAnsi" w:hAnsiTheme="majorHAnsi" w:cstheme="majorHAnsi"/>
+          <w:color w:val="4664BE"/>
+          <w:szCs w:val="21"/>
+        </w:rPr>
+      </w:pPr>
+      <w:r>
+        <w:rPr>
+          <w:rFonts w:asciiTheme="minorHAnsi" w:hAnsiTheme="minorHAnsi"/>
           <w:b w:val="0"/>
-          <w:color w:val="FFFFFF" w:themeColor="background1"/>
+          <w:color w:val="000000" w:themeColor="text1"/>
         </w:rPr>
         <w:t>O site da Fase 1, que usava apenas a formatação padrão do navegador, passou a utilizar o Bootstrap 5.3 (hospedado no próprio projeto, em vendor/bootstrap/) somado a uma folha de estilo própria (css/estilo.css) com a paleta da marca. A página inicial recebeu um carrossel com quatro imagens, indicadores, botões de navegação e troca automática a cada cinco segundos. O menu virou uma navbar responsiva, com submenu de produtos e botão sanduíche no celular; os produtos passaram a ser exibidos em cartões e as tabelas de preços ganharam rolagem horizontal em telas pequenas.</w:t>
       </w:r>
       <w:r>
         <w:rPr>
-          <w:rStyle w:val="normaltextrun"/>
-          <w:rFonts w:asciiTheme="majorHAnsi" w:hAnsiTheme="majorHAnsi" w:cstheme="majorHAnsi"/>
-          <w:b/>
-          <w:color w:val="FFFFFF" w:themeColor="background1"/>
-        </w:rPr>
-      </w:r>
-      <w:r>
-        <w:rPr>
-          <w:rStyle w:val="normaltextrun"/>
-          <w:rFonts w:asciiTheme="majorHAnsi" w:hAnsiTheme="majorHAnsi" w:cstheme="majorHAnsi"/>
-          <w:b/>
-          <w:color w:val="FFFFFF" w:themeColor="background1"/>
-        </w:rPr>
-      </w:r>
-    </w:p>
-    <w:p>
-      <w:pPr>
-        <w:shd w:val="clear" w:color="auto" w:fill="32966E"/>
+          <w:rFonts w:asciiTheme="minorHAnsi" w:hAnsiTheme="minorHAnsi"/>
+          <w:color w:val="000000" w:themeColor="text1"/>
+        </w:rPr>
+      </w:r>
+    </w:p>
+    <w:p>
+      <w:pPr>
         <w:spacing w:after="0" w:line="240" w:lineRule="auto"/>
         <w:jc w:val="both"/>
         <w:rPr>
           <w:rFonts w:asciiTheme="minorHAnsi" w:hAnsiTheme="minorHAnsi" w:cstheme="minorHAnsi"/>
           <w:b/>
           <w:bCs/>
-          <w:color w:val="FFFFFF" w:themeColor="background1"/>
-          <w:spacing w:val="-2"/>
-          <w:sz w:val="20"/>
-          <w:szCs w:val="20"/>
-        </w:rPr>
-      </w:pPr>
-      <w:r>
-        <w:rPr>
-          <w:rStyle w:val="normaltextrun"/>
-          <w:rFonts w:asciiTheme="majorHAnsi" w:hAnsiTheme="majorHAnsi" w:cstheme="majorHAnsi"/>
-          <w:b/>
-          <w:color w:val="FFFFFF" w:themeColor="background1"/>
+          <w:color w:val="4664BE"/>
+          <w:szCs w:val="21"/>
+        </w:rPr>
+      </w:pPr>
+      <w:r>
+        <w:rPr>
+          <w:rFonts w:asciiTheme="minorHAnsi" w:hAnsiTheme="minorHAnsi"/>
+          <w:b/>
+          <w:color w:val="000000" w:themeColor="text1"/>
         </w:rPr>
         <w:t>2. JavaScript e funções temporais</w:t>
       </w:r>
       <w:r>
         <w:rPr>
-          <w:rStyle w:val="normaltextrun"/>
-          <w:rFonts w:asciiTheme="majorHAnsi" w:hAnsiTheme="majorHAnsi" w:cstheme="majorHAnsi"/>
-          <w:b/>
-          <w:color w:val="FFFFFF" w:themeColor="background1"/>
-        </w:rPr>
-      </w:r>
-      <w:r>
-        <w:rPr>
-          <w:rStyle w:val="normaltextrun"/>
-          <w:rFonts w:asciiTheme="majorHAnsi" w:hAnsiTheme="majorHAnsi" w:cstheme="majorHAnsi"/>
-          <w:b/>
-          <w:color w:val="FFFFFF" w:themeColor="background1"/>
-        </w:rPr>
-      </w:r>
-    </w:p>
-    <w:p>
-      <w:pPr>
-        <w:shd w:val="clear" w:color="auto" w:fill="32966E"/>
+          <w:rFonts w:asciiTheme="minorHAnsi" w:hAnsiTheme="minorHAnsi"/>
+          <w:color w:val="000000" w:themeColor="text1"/>
+        </w:rPr>
+      </w:r>
+    </w:p>
+    <w:p>
+      <w:pPr>
         <w:spacing w:after="0" w:line="240" w:lineRule="auto"/>
         <w:jc w:val="both"/>
         <w:rPr>
           <w:rFonts w:asciiTheme="minorHAnsi" w:hAnsiTheme="minorHAnsi" w:cstheme="minorHAnsi"/>
           <w:b/>
           <w:bCs/>
-          <w:color w:val="FFFFFF" w:themeColor="background1"/>
-          <w:spacing w:val="-2"/>
-          <w:sz w:val="20"/>
-          <w:szCs w:val="20"/>
-        </w:rPr>
-      </w:pPr>
-      <w:r>
-        <w:rPr>
-          <w:rStyle w:val="normaltextrun"/>
-          <w:rFonts w:asciiTheme="majorHAnsi" w:hAnsiTheme="majorHAnsi" w:cstheme="majorHAnsi"/>
+          <w:color w:val="4664BE"/>
+          <w:szCs w:val="21"/>
+        </w:rPr>
+      </w:pPr>
+      <w:r>
+        <w:rPr>
+          <w:rFonts w:asciiTheme="minorHAnsi" w:hAnsiTheme="minorHAnsi"/>
           <w:b w:val="0"/>
-          <w:color w:val="FFFFFF" w:themeColor="background1"/>
+          <w:color w:val="000000" w:themeColor="text1"/>
         </w:rPr>
         <w:t>O código JavaScript foi separado em sete arquivos comentados, dentro da pasta js/: app.js (funções comuns), precos.js (tabela de preços), formularios.js (máscaras e validações), cadastro.js, agendamento.js, produtos.js e contato.js. As funções temporais aparecem na faixa superior de todas as páginas, com relógio e data atualizados a cada segundo, saudação conforme o período do dia e aviso automático de loja aberta ou fechada calculado a partir do horário de funcionamento; na página de agendamento há ainda uma contagem regressiva até o horário marcado. Também foram implementadas a busca e a ordenação de produtos por nome ou preço, o simulador de valores dos serviços e o preenchimento automático do ano no rodapé.</w:t>
       </w:r>
       <w:r>
         <w:rPr>
-          <w:rStyle w:val="normaltextrun"/>
-          <w:rFonts w:asciiTheme="majorHAnsi" w:hAnsiTheme="majorHAnsi" w:cstheme="majorHAnsi"/>
-          <w:b/>
-          <w:color w:val="FFFFFF" w:themeColor="background1"/>
-        </w:rPr>
-      </w:r>
-      <w:r>
-        <w:rPr>
-          <w:rStyle w:val="normaltextrun"/>
-          <w:rFonts w:asciiTheme="majorHAnsi" w:hAnsiTheme="majorHAnsi" w:cstheme="majorHAnsi"/>
-          <w:b/>
-          <w:color w:val="FFFFFF" w:themeColor="background1"/>
-        </w:rPr>
-      </w:r>
-    </w:p>
-    <w:p>
-      <w:pPr>
-        <w:shd w:val="clear" w:color="auto" w:fill="32966E"/>
+          <w:rFonts w:asciiTheme="minorHAnsi" w:hAnsiTheme="minorHAnsi"/>
+          <w:color w:val="000000" w:themeColor="text1"/>
+        </w:rPr>
+      </w:r>
+    </w:p>
+    <w:p>
+      <w:pPr>
         <w:spacing w:after="0" w:line="240" w:lineRule="auto"/>
         <w:jc w:val="both"/>
         <w:rPr>
           <w:rFonts w:asciiTheme="minorHAnsi" w:hAnsiTheme="minorHAnsi" w:cstheme="minorHAnsi"/>
           <w:b/>
           <w:bCs/>
-          <w:color w:val="FFFFFF" w:themeColor="background1"/>
-          <w:spacing w:val="-2"/>
-          <w:sz w:val="20"/>
-          <w:szCs w:val="20"/>
-        </w:rPr>
-      </w:pPr>
-      <w:r>
-        <w:rPr>
-          <w:rStyle w:val="normaltextrun"/>
-          <w:rFonts w:asciiTheme="majorHAnsi" w:hAnsiTheme="majorHAnsi" w:cstheme="majorHAnsi"/>
-          <w:b/>
-          <w:color w:val="FFFFFF" w:themeColor="background1"/>
+          <w:color w:val="4664BE"/>
+          <w:szCs w:val="21"/>
+        </w:rPr>
+      </w:pPr>
+      <w:r>
+        <w:rPr>
+          <w:rFonts w:asciiTheme="minorHAnsi" w:hAnsiTheme="minorHAnsi"/>
+          <w:b/>
+          <w:color w:val="000000" w:themeColor="text1"/>
         </w:rPr>
         <w:t>3. Formulário de cadastro do cliente e do pet</w:t>
       </w:r>
       <w:r>
         <w:rPr>
-          <w:rStyle w:val="normaltextrun"/>
-          <w:rFonts w:asciiTheme="majorHAnsi" w:hAnsiTheme="majorHAnsi" w:cstheme="majorHAnsi"/>
-          <w:b/>
-          <w:color w:val="FFFFFF" w:themeColor="background1"/>
-        </w:rPr>
-      </w:r>
-      <w:r>
-        <w:rPr>
-          <w:rStyle w:val="normaltextrun"/>
-          <w:rFonts w:asciiTheme="majorHAnsi" w:hAnsiTheme="majorHAnsi" w:cstheme="majorHAnsi"/>
-          <w:b/>
-          <w:color w:val="FFFFFF" w:themeColor="background1"/>
-        </w:rPr>
-      </w:r>
-    </w:p>
-    <w:p>
-      <w:pPr>
-        <w:shd w:val="clear" w:color="auto" w:fill="32966E"/>
+          <w:rFonts w:asciiTheme="minorHAnsi" w:hAnsiTheme="minorHAnsi"/>
+          <w:color w:val="000000" w:themeColor="text1"/>
+        </w:rPr>
+      </w:r>
+    </w:p>
+    <w:p>
+      <w:pPr>
         <w:spacing w:after="0" w:line="240" w:lineRule="auto"/>
         <w:jc w:val="both"/>
         <w:rPr>
           <w:rFonts w:asciiTheme="minorHAnsi" w:hAnsiTheme="minorHAnsi" w:cstheme="minorHAnsi"/>
           <w:b/>
           <w:bCs/>
-          <w:color w:val="FFFFFF" w:themeColor="background1"/>
-          <w:spacing w:val="-2"/>
-          <w:sz w:val="20"/>
-          <w:szCs w:val="20"/>
-        </w:rPr>
-      </w:pPr>
-      <w:r>
-        <w:rPr>
-          <w:rStyle w:val="normaltextrun"/>
-          <w:rFonts w:asciiTheme="majorHAnsi" w:hAnsiTheme="majorHAnsi" w:cstheme="majorHAnsi"/>
+          <w:color w:val="4664BE"/>
+          <w:szCs w:val="21"/>
+        </w:rPr>
+      </w:pPr>
+      <w:r>
+        <w:rPr>
+          <w:rFonts w:asciiTheme="minorHAnsi" w:hAnsiTheme="minorHAnsi"/>
           <w:b w:val="0"/>
-          <w:color w:val="FFFFFF" w:themeColor="background1"/>
+          <w:color w:val="000000" w:themeColor="text1"/>
         </w:rPr>
         <w:t>A página cadastro.html reúne, em quatro grupos de campos (fieldset/legend), os dados de identificação do cliente — nome, CPF, data de nascimento, sexo, e-mail, telefone fixo, celular e endereço completo — e os dados do pet — nome, espécie, raça, idade, porte, cuidados especiais e observações. Foram usados campos de tipos variados (text, email, tel, date, number, select, textarea, radio button, check box e datalist), com placeholder, campos obrigatórios, validação do Bootstrap, máscaras de CPF, telefone e CEP e verificação dos dígitos verificadores do CPF. O cliente pode cadastrar mais de um pet no mesmo formulário e, ao final, recebe um resumo do cadastro.</w:t>
       </w:r>
       <w:r>
         <w:rPr>
-          <w:rStyle w:val="normaltextrun"/>
-          <w:rFonts w:asciiTheme="majorHAnsi" w:hAnsiTheme="majorHAnsi" w:cstheme="majorHAnsi"/>
-          <w:b/>
-          <w:color w:val="FFFFFF" w:themeColor="background1"/>
-        </w:rPr>
-      </w:r>
-      <w:r>
-        <w:rPr>
-          <w:rStyle w:val="normaltextrun"/>
-          <w:rFonts w:asciiTheme="majorHAnsi" w:hAnsiTheme="majorHAnsi" w:cstheme="majorHAnsi"/>
-          <w:b/>
-          <w:color w:val="FFFFFF" w:themeColor="background1"/>
-        </w:rPr>
-      </w:r>
-    </w:p>
-    <w:p>
-      <w:pPr>
-        <w:shd w:val="clear" w:color="auto" w:fill="32966E"/>
+          <w:rFonts w:asciiTheme="minorHAnsi" w:hAnsiTheme="minorHAnsi"/>
+          <w:color w:val="000000" w:themeColor="text1"/>
+        </w:rPr>
+      </w:r>
+    </w:p>
+    <w:p>
+      <w:pPr>
         <w:spacing w:after="0" w:line="240" w:lineRule="auto"/>
         <w:jc w:val="both"/>
         <w:rPr>
           <w:rFonts w:asciiTheme="minorHAnsi" w:hAnsiTheme="minorHAnsi" w:cstheme="minorHAnsi"/>
           <w:b/>
           <w:bCs/>
-          <w:color w:val="FFFFFF" w:themeColor="background1"/>
-          <w:spacing w:val="-2"/>
-          <w:sz w:val="20"/>
-          <w:szCs w:val="20"/>
-        </w:rPr>
-      </w:pPr>
-      <w:r>
-        <w:rPr>
-          <w:rStyle w:val="normaltextrun"/>
-          <w:rFonts w:asciiTheme="majorHAnsi" w:hAnsiTheme="majorHAnsi" w:cstheme="majorHAnsi"/>
-          <w:b/>
-          <w:color w:val="FFFFFF" w:themeColor="background1"/>
+          <w:color w:val="4664BE"/>
+          <w:szCs w:val="21"/>
+        </w:rPr>
+      </w:pPr>
+      <w:r>
+        <w:rPr>
+          <w:rFonts w:asciiTheme="minorHAnsi" w:hAnsiTheme="minorHAnsi"/>
+          <w:b/>
+          <w:color w:val="000000" w:themeColor="text1"/>
         </w:rPr>
         <w:t>4. Escolha do serviço e método de agendamento</w:t>
       </w:r>
       <w:r>
         <w:rPr>
-          <w:rStyle w:val="normaltextrun"/>
-          <w:rFonts w:asciiTheme="majorHAnsi" w:hAnsiTheme="majorHAnsi" w:cstheme="majorHAnsi"/>
-          <w:b/>
-          <w:color w:val="FFFFFF" w:themeColor="background1"/>
-        </w:rPr>
-      </w:r>
-      <w:r>
-        <w:rPr>
-          <w:rStyle w:val="normaltextrun"/>
-          <w:rFonts w:asciiTheme="majorHAnsi" w:hAnsiTheme="majorHAnsi" w:cstheme="majorHAnsi"/>
-          <w:b/>
-          <w:color w:val="FFFFFF" w:themeColor="background1"/>
-        </w:rPr>
-      </w:r>
-    </w:p>
-    <w:p>
-      <w:pPr>
-        <w:shd w:val="clear" w:color="auto" w:fill="32966E"/>
+          <w:rFonts w:asciiTheme="minorHAnsi" w:hAnsiTheme="minorHAnsi"/>
+          <w:color w:val="000000" w:themeColor="text1"/>
+        </w:rPr>
+      </w:r>
+    </w:p>
+    <w:p>
+      <w:pPr>
         <w:spacing w:after="0" w:line="240" w:lineRule="auto"/>
         <w:jc w:val="both"/>
         <w:rPr>
           <w:rFonts w:asciiTheme="minorHAnsi" w:hAnsiTheme="minorHAnsi" w:cstheme="minorHAnsi"/>
           <w:b/>
           <w:bCs/>
-          <w:color w:val="FFFFFF" w:themeColor="background1"/>
-          <w:spacing w:val="-2"/>
-          <w:sz w:val="20"/>
-          <w:szCs w:val="20"/>
-        </w:rPr>
-      </w:pPr>
-      <w:r>
-        <w:rPr>
-          <w:rStyle w:val="normaltextrun"/>
-          <w:rFonts w:asciiTheme="majorHAnsi" w:hAnsiTheme="majorHAnsi" w:cstheme="majorHAnsi"/>
+          <w:color w:val="4664BE"/>
+          <w:szCs w:val="21"/>
+        </w:rPr>
+      </w:pPr>
+      <w:r>
+        <w:rPr>
+          <w:rFonts w:asciiTheme="minorHAnsi" w:hAnsiTheme="minorHAnsi"/>
           <w:b w:val="0"/>
-          <w:color w:val="FFFFFF" w:themeColor="background1"/>
+          <w:color w:val="000000" w:themeColor="text1"/>
         </w:rPr>
         <w:t>A página agendamento.html permite escolher entre banho, tosa higiênica e tosa completa e entre as duas formas de atendimento: tele-busca, que exibe campos adicionais de endereço e CEP para a coleta, ou entrega do pet na loja. A data é escolhida em um calendário (input type="date") limitado aos próximos 60 dias, com no mínimo um dia de antecedência e sem domingos; os horários disponíveis são gerados conforme o dia da semana e a duração do serviço escolhido. O valor total é calculado em tempo real, somando o preço por porte e a tele-busca, e o agendamento confirmado gera um resumo com a contagem regressiva.</w:t>
       </w:r>
       <w:r>
         <w:rPr>
-          <w:rStyle w:val="normaltextrun"/>
-          <w:rFonts w:asciiTheme="majorHAnsi" w:hAnsiTheme="majorHAnsi" w:cstheme="majorHAnsi"/>
-          <w:b/>
-          <w:color w:val="FFFFFF" w:themeColor="background1"/>
-        </w:rPr>
-      </w:r>
-      <w:r>
-        <w:rPr>
-          <w:rStyle w:val="normaltextrun"/>
-          <w:rFonts w:asciiTheme="majorHAnsi" w:hAnsiTheme="majorHAnsi" w:cstheme="majorHAnsi"/>
-          <w:b/>
-          <w:color w:val="FFFFFF" w:themeColor="background1"/>
-        </w:rPr>
-      </w:r>
-    </w:p>
-    <w:p>
-      <w:pPr>
-        <w:shd w:val="clear" w:color="auto" w:fill="32966E"/>
+          <w:rFonts w:asciiTheme="minorHAnsi" w:hAnsiTheme="minorHAnsi"/>
+          <w:color w:val="000000" w:themeColor="text1"/>
+        </w:rPr>
+      </w:r>
+    </w:p>
+    <w:p>
+      <w:pPr>
         <w:spacing w:after="0" w:line="240" w:lineRule="auto"/>
         <w:jc w:val="both"/>
         <w:rPr>
           <w:rFonts w:asciiTheme="minorHAnsi" w:hAnsiTheme="minorHAnsi" w:cstheme="minorHAnsi"/>
           <w:b/>
           <w:bCs/>
-          <w:color w:val="FFFFFF" w:themeColor="background1"/>
-          <w:spacing w:val="-2"/>
-          <w:sz w:val="20"/>
-          <w:szCs w:val="20"/>
-        </w:rPr>
-      </w:pPr>
-      <w:r>
-        <w:rPr>
-          <w:rStyle w:val="normaltextrun"/>
-          <w:rFonts w:asciiTheme="majorHAnsi" w:hAnsiTheme="majorHAnsi" w:cstheme="majorHAnsi"/>
-          <w:b/>
-          <w:color w:val="FFFFFF" w:themeColor="background1"/>
+          <w:color w:val="4664BE"/>
+          <w:szCs w:val="21"/>
+        </w:rPr>
+      </w:pPr>
+      <w:r>
+        <w:rPr>
+          <w:rFonts w:asciiTheme="minorHAnsi" w:hAnsiTheme="minorHAnsi"/>
+          <w:b/>
+          <w:color w:val="000000" w:themeColor="text1"/>
         </w:rPr>
         <w:t>5. Acessibilidade</w:t>
       </w:r>
       <w:r>
         <w:rPr>
-          <w:rStyle w:val="normaltextrun"/>
-          <w:rFonts w:asciiTheme="majorHAnsi" w:hAnsiTheme="majorHAnsi" w:cstheme="majorHAnsi"/>
-          <w:b/>
-          <w:color w:val="FFFFFF" w:themeColor="background1"/>
-        </w:rPr>
-      </w:r>
-      <w:r>
-        <w:rPr>
-          <w:rStyle w:val="normaltextrun"/>
-          <w:rFonts w:asciiTheme="majorHAnsi" w:hAnsiTheme="majorHAnsi" w:cstheme="majorHAnsi"/>
-          <w:b/>
-          <w:color w:val="FFFFFF" w:themeColor="background1"/>
-        </w:rPr>
-      </w:r>
-    </w:p>
-    <w:p>
-      <w:pPr>
-        <w:shd w:val="clear" w:color="auto" w:fill="32966E"/>
+          <w:rFonts w:asciiTheme="minorHAnsi" w:hAnsiTheme="minorHAnsi"/>
+          <w:color w:val="000000" w:themeColor="text1"/>
+        </w:rPr>
+      </w:r>
+    </w:p>
+    <w:p>
+      <w:pPr>
         <w:spacing w:after="0" w:line="240" w:lineRule="auto"/>
         <w:jc w:val="both"/>
         <w:rPr>
           <w:rFonts w:asciiTheme="minorHAnsi" w:hAnsiTheme="minorHAnsi" w:cstheme="minorHAnsi"/>
           <w:b/>
           <w:bCs/>
-          <w:color w:val="FFFFFF" w:themeColor="background1"/>
-          <w:spacing w:val="-2"/>
-          <w:sz w:val="20"/>
-          <w:szCs w:val="20"/>
-        </w:rPr>
-      </w:pPr>
-      <w:r>
-        <w:rPr>
-          <w:rStyle w:val="normaltextrun"/>
-          <w:rFonts w:asciiTheme="majorHAnsi" w:hAnsiTheme="majorHAnsi" w:cstheme="majorHAnsi"/>
+          <w:color w:val="4664BE"/>
+          <w:szCs w:val="21"/>
+        </w:rPr>
+      </w:pPr>
+      <w:r>
+        <w:rPr>
+          <w:rFonts w:asciiTheme="minorHAnsi" w:hAnsiTheme="minorHAnsi"/>
           <w:b w:val="0"/>
-          <w:color w:val="FFFFFF" w:themeColor="background1"/>
+          <w:color w:val="000000" w:themeColor="text1"/>
         </w:rPr>
         <w:t>Todas as imagens receberam audiodescrição no atributo alt, descrevendo a cena e não apenas o nome do produto. Foram acrescentados ainda: botão de alto contraste e botões de aumento e redução de fonte, com a preferência salva no navegador; link “pular para o conteúdo principal” como primeiro elemento focável; contorno de foco reforçado para navegação por teclado; regiões aria-live que anunciam erros, confirmações e resultados de busca; marcação semântica com header, nav, main, section, aside e footer; rótulos (label) associados a todos os campos; tabelas com caption e cabeçalhos identificados por scope; e respeito à preferência do sistema por menos animações, que interrompe o giro automático do carrossel.</w:t>
       </w:r>
       <w:r>
         <w:rPr>
-          <w:rStyle w:val="normaltextrun"/>
-          <w:rFonts w:asciiTheme="majorHAnsi" w:hAnsiTheme="majorHAnsi" w:cstheme="majorHAnsi"/>
-          <w:b/>
-          <w:color w:val="FFFFFF" w:themeColor="background1"/>
-        </w:rPr>
-      </w:r>
-      <w:r>
-        <w:rPr>
-          <w:rStyle w:val="normaltextrun"/>
-          <w:rFonts w:asciiTheme="majorHAnsi" w:hAnsiTheme="majorHAnsi" w:cstheme="majorHAnsi"/>
-          <w:b/>
-          <w:color w:val="FFFFFF" w:themeColor="background1"/>
-        </w:rPr>
-      </w:r>
-    </w:p>
-    <w:p>
-      <w:pPr>
-        <w:shd w:val="clear" w:color="auto" w:fill="32966E"/>
+          <w:rFonts w:asciiTheme="minorHAnsi" w:hAnsiTheme="minorHAnsi"/>
+          <w:color w:val="000000" w:themeColor="text1"/>
+        </w:rPr>
+      </w:r>
+    </w:p>
+    <w:p>
+      <w:pPr>
         <w:spacing w:after="0" w:line="240" w:lineRule="auto"/>
         <w:jc w:val="both"/>
         <w:rPr>
           <w:rFonts w:asciiTheme="minorHAnsi" w:hAnsiTheme="minorHAnsi" w:cstheme="minorHAnsi"/>
           <w:b/>
           <w:bCs/>
-          <w:color w:val="FFFFFF" w:themeColor="background1"/>
-          <w:spacing w:val="-2"/>
-          <w:sz w:val="20"/>
-          <w:szCs w:val="20"/>
-        </w:rPr>
-      </w:pPr>
-      <w:r>
-        <w:rPr>
-          <w:rStyle w:val="normaltextrun"/>
-          <w:rFonts w:asciiTheme="majorHAnsi" w:hAnsiTheme="majorHAnsi" w:cstheme="majorHAnsi"/>
-          <w:b/>
-          <w:color w:val="FFFFFF" w:themeColor="background1"/>
+          <w:color w:val="4664BE"/>
+          <w:szCs w:val="21"/>
+        </w:rPr>
+      </w:pPr>
+      <w:r>
+        <w:rPr>
+          <w:rFonts w:asciiTheme="minorHAnsi" w:hAnsiTheme="minorHAnsi"/>
+          <w:b/>
+          <w:color w:val="000000" w:themeColor="text1"/>
         </w:rPr>
         <w:t>Ajustes realizados em relação à Fase 1</w:t>
       </w:r>
       <w:r>
         <w:rPr>
-          <w:rStyle w:val="normaltextrun"/>
-          <w:rFonts w:asciiTheme="majorHAnsi" w:hAnsiTheme="majorHAnsi" w:cstheme="majorHAnsi"/>
-          <w:b/>
-          <w:color w:val="FFFFFF" w:themeColor="background1"/>
-        </w:rPr>
-      </w:r>
-      <w:r>
-        <w:rPr>
-          <w:rStyle w:val="normaltextrun"/>
-          <w:rFonts w:asciiTheme="majorHAnsi" w:hAnsiTheme="majorHAnsi" w:cstheme="majorHAnsi"/>
-          <w:b/>
-          <w:color w:val="FFFFFF" w:themeColor="background1"/>
-        </w:rPr>
-      </w:r>
-    </w:p>
-    <w:p>
-      <w:pPr>
-        <w:shd w:val="clear" w:color="auto" w:fill="32966E"/>
+          <w:rFonts w:asciiTheme="minorHAnsi" w:hAnsiTheme="minorHAnsi"/>
+          <w:color w:val="000000" w:themeColor="text1"/>
+        </w:rPr>
+      </w:r>
+    </w:p>
+    <w:p>
+      <w:pPr>
         <w:spacing w:after="0" w:line="240" w:lineRule="auto"/>
         <w:jc w:val="both"/>
         <w:rPr>
           <w:rFonts w:asciiTheme="minorHAnsi" w:hAnsiTheme="minorHAnsi" w:cstheme="minorHAnsi"/>
           <w:b/>
           <w:bCs/>
-          <w:color w:val="FFFFFF" w:themeColor="background1"/>
-          <w:spacing w:val="-2"/>
-          <w:sz w:val="20"/>
-          <w:szCs w:val="20"/>
-        </w:rPr>
-      </w:pPr>
-      <w:r>
-        <w:rPr>
-          <w:rStyle w:val="normaltextrun"/>
-          <w:rFonts w:asciiTheme="majorHAnsi" w:hAnsiTheme="majorHAnsi" w:cstheme="majorHAnsi"/>
+          <w:color w:val="4664BE"/>
+          <w:szCs w:val="21"/>
+        </w:rPr>
+      </w:pPr>
+      <w:r>
+        <w:rPr>
+          <w:rFonts w:asciiTheme="minorHAnsi" w:hAnsiTheme="minorHAnsi"/>
           <w:b w:val="0"/>
-          <w:color w:val="FFFFFF" w:themeColor="background1"/>
+          <w:color w:val="000000" w:themeColor="text1"/>
         </w:rPr>
         <w:t>a) O código foi reorganizado em pastas (css/, js/, img/ e vendor/), com comentários explicativos em todos os arquivos.</w:t>
       </w:r>
       <w:r>
         <w:rPr>
-          <w:rStyle w:val="normaltextrun"/>
-          <w:rFonts w:asciiTheme="majorHAnsi" w:hAnsiTheme="majorHAnsi" w:cstheme="majorHAnsi"/>
-          <w:b/>
-          <w:color w:val="FFFFFF" w:themeColor="background1"/>
-        </w:rPr>
-      </w:r>
-      <w:r>
-        <w:rPr>
-          <w:rStyle w:val="normaltextrun"/>
-          <w:rFonts w:asciiTheme="majorHAnsi" w:hAnsiTheme="majorHAnsi" w:cstheme="majorHAnsi"/>
-          <w:b/>
-          <w:color w:val="FFFFFF" w:themeColor="background1"/>
-        </w:rPr>
-      </w:r>
-    </w:p>
-    <w:p>
-      <w:pPr>
-        <w:shd w:val="clear" w:color="auto" w:fill="32966E"/>
+          <w:rFonts w:asciiTheme="minorHAnsi" w:hAnsiTheme="minorHAnsi"/>
+          <w:color w:val="000000" w:themeColor="text1"/>
+        </w:rPr>
+      </w:r>
+    </w:p>
+    <w:p>
+      <w:pPr>
         <w:spacing w:after="0" w:line="240" w:lineRule="auto"/>
         <w:jc w:val="both"/>
         <w:rPr>
           <w:rFonts w:asciiTheme="minorHAnsi" w:hAnsiTheme="minorHAnsi" w:cstheme="minorHAnsi"/>
           <w:b/>
           <w:bCs/>
-          <w:color w:val="FFFFFF" w:themeColor="background1"/>
-          <w:spacing w:val="-2"/>
-          <w:sz w:val="20"/>
-          <w:szCs w:val="20"/>
-        </w:rPr>
-      </w:pPr>
-      <w:r>
-        <w:rPr>
-          <w:rStyle w:val="normaltextrun"/>
-          <w:rFonts w:asciiTheme="majorHAnsi" w:hAnsiTheme="majorHAnsi" w:cstheme="majorHAnsi"/>
+          <w:color w:val="4664BE"/>
+          <w:szCs w:val="21"/>
+        </w:rPr>
+      </w:pPr>
+      <w:r>
+        <w:rPr>
+          <w:rFonts w:asciiTheme="minorHAnsi" w:hAnsiTheme="minorHAnsi"/>
           <w:b w:val="0"/>
-          <w:color w:val="FFFFFF" w:themeColor="background1"/>
+          <w:color w:val="000000" w:themeColor="text1"/>
         </w:rPr>
         <w:t>b) Foram criadas duas novas páginas — Cadastro e Agendamento — e o menu foi reestruturado para acomodá-las, com um submenu para as três categorias de produtos.</w:t>
       </w:r>
       <w:r>
         <w:rPr>
-          <w:rStyle w:val="normaltextrun"/>
-          <w:rFonts w:asciiTheme="majorHAnsi" w:hAnsiTheme="majorHAnsi" w:cstheme="majorHAnsi"/>
-          <w:b/>
-          <w:color w:val="FFFFFF" w:themeColor="background1"/>
-        </w:rPr>
-      </w:r>
-      <w:r>
-        <w:rPr>
-          <w:rStyle w:val="normaltextrun"/>
-          <w:rFonts w:asciiTheme="majorHAnsi" w:hAnsiTheme="majorHAnsi" w:cstheme="majorHAnsi"/>
-          <w:b/>
-          <w:color w:val="FFFFFF" w:themeColor="background1"/>
-        </w:rPr>
-      </w:r>
-    </w:p>
-    <w:p>
-      <w:pPr>
-        <w:shd w:val="clear" w:color="auto" w:fill="32966E"/>
+          <w:rFonts w:asciiTheme="minorHAnsi" w:hAnsiTheme="minorHAnsi"/>
+          <w:color w:val="000000" w:themeColor="text1"/>
+        </w:rPr>
+      </w:r>
+    </w:p>
+    <w:p>
+      <w:pPr>
         <w:spacing w:after="0" w:line="240" w:lineRule="auto"/>
         <w:jc w:val="both"/>
         <w:rPr>
           <w:rFonts w:asciiTheme="minorHAnsi" w:hAnsiTheme="minorHAnsi" w:cstheme="minorHAnsi"/>
           <w:b/>
           <w:bCs/>
-          <w:color w:val="FFFFFF" w:themeColor="background1"/>
-          <w:spacing w:val="-2"/>
-          <w:sz w:val="20"/>
-          <w:szCs w:val="20"/>
-        </w:rPr>
-      </w:pPr>
-      <w:r>
-        <w:rPr>
-          <w:rStyle w:val="normaltextrun"/>
-          <w:rFonts w:asciiTheme="majorHAnsi" w:hAnsiTheme="majorHAnsi" w:cstheme="majorHAnsi"/>
+          <w:color w:val="4664BE"/>
+          <w:szCs w:val="21"/>
+        </w:rPr>
+      </w:pPr>
+      <w:r>
+        <w:rPr>
+          <w:rFonts w:asciiTheme="minorHAnsi" w:hAnsiTheme="minorHAnsi"/>
           <w:b w:val="0"/>
-          <w:color w:val="FFFFFF" w:themeColor="background1"/>
+          <w:color w:val="000000" w:themeColor="text1"/>
         </w:rPr>
         <w:t>c) O formulário de contato, que era apenas estrutural, passou a ter validação, máscara de telefone e mensagem de confirmação.</w:t>
       </w:r>
       <w:r>
         <w:rPr>
-          <w:rStyle w:val="normaltextrun"/>
-          <w:rFonts w:asciiTheme="majorHAnsi" w:hAnsiTheme="majorHAnsi" w:cstheme="majorHAnsi"/>
-          <w:b/>
-          <w:color w:val="FFFFFF" w:themeColor="background1"/>
-        </w:rPr>
-      </w:r>
-      <w:r>
-        <w:rPr>
-          <w:rStyle w:val="normaltextrun"/>
-          <w:rFonts w:asciiTheme="majorHAnsi" w:hAnsiTheme="majorHAnsi" w:cstheme="majorHAnsi"/>
-          <w:b/>
-          <w:color w:val="FFFFFF" w:themeColor="background1"/>
-        </w:rPr>
-      </w:r>
-    </w:p>
-    <w:p>
-      <w:pPr>
-        <w:shd w:val="clear" w:color="auto" w:fill="32966E"/>
+          <w:rFonts w:asciiTheme="minorHAnsi" w:hAnsiTheme="minorHAnsi"/>
+          <w:color w:val="000000" w:themeColor="text1"/>
+        </w:rPr>
+      </w:r>
+    </w:p>
+    <w:p>
+      <w:pPr>
         <w:spacing w:after="0" w:line="240" w:lineRule="auto"/>
         <w:jc w:val="both"/>
         <w:rPr>
           <w:rFonts w:asciiTheme="minorHAnsi" w:hAnsiTheme="minorHAnsi" w:cstheme="minorHAnsi"/>
           <w:b/>
           <w:bCs/>
-          <w:color w:val="FFFFFF" w:themeColor="background1"/>
-          <w:spacing w:val="-2"/>
-          <w:sz w:val="20"/>
-          <w:szCs w:val="20"/>
-        </w:rPr>
-      </w:pPr>
-      <w:r>
-        <w:rPr>
-          <w:rStyle w:val="normaltextrun"/>
-          <w:rFonts w:asciiTheme="majorHAnsi" w:hAnsiTheme="majorHAnsi" w:cstheme="majorHAnsi"/>
+          <w:color w:val="4664BE"/>
+          <w:szCs w:val="21"/>
+        </w:rPr>
+      </w:pPr>
+      <w:r>
+        <w:rPr>
+          <w:rFonts w:asciiTheme="minorHAnsi" w:hAnsiTheme="minorHAnsi"/>
           <w:b w:val="0"/>
-          <w:color w:val="FFFFFF" w:themeColor="background1"/>
+          <w:color w:val="000000" w:themeColor="text1"/>
         </w:rPr>
         <w:t>d) Os textos alternativos das imagens foram reescritos com descrição detalhada, e a página de erro 404 foi refeita no novo layout.</w:t>
       </w:r>
       <w:r>
         <w:rPr>
-          <w:rStyle w:val="normaltextrun"/>
-          <w:rFonts w:asciiTheme="majorHAnsi" w:hAnsiTheme="majorHAnsi" w:cstheme="majorHAnsi"/>
-          <w:b/>
-          <w:color w:val="FFFFFF" w:themeColor="background1"/>
-        </w:rPr>
-      </w:r>
-      <w:r>
-        <w:rPr>
-          <w:rStyle w:val="normaltextrun"/>
-          <w:rFonts w:asciiTheme="majorHAnsi" w:hAnsiTheme="majorHAnsi" w:cstheme="majorHAnsi"/>
-          <w:b/>
-          <w:color w:val="FFFFFF" w:themeColor="background1"/>
-        </w:rPr>
-      </w:r>
-    </w:p>
-    <w:p>
-      <w:pPr>
-        <w:shd w:val="clear" w:color="auto" w:fill="32966E"/>
+          <w:rFonts w:asciiTheme="minorHAnsi" w:hAnsiTheme="minorHAnsi"/>
+          <w:color w:val="000000" w:themeColor="text1"/>
+        </w:rPr>
+      </w:r>
+    </w:p>
+    <w:p>
+      <w:pPr>
         <w:spacing w:after="0" w:line="240" w:lineRule="auto"/>
         <w:jc w:val="both"/>
         <w:rPr>
           <w:rFonts w:asciiTheme="minorHAnsi" w:hAnsiTheme="minorHAnsi" w:cstheme="minorHAnsi"/>
           <w:b/>
           <w:bCs/>
-          <w:color w:val="FFFFFF" w:themeColor="background1"/>
-          <w:spacing w:val="-2"/>
-          <w:sz w:val="20"/>
-          <w:szCs w:val="20"/>
-        </w:rPr>
-      </w:pPr>
-      <w:r>
-        <w:rPr>
-          <w:rStyle w:val="normaltextrun"/>
-          <w:rFonts w:asciiTheme="majorHAnsi" w:hAnsiTheme="majorHAnsi" w:cstheme="majorHAnsi"/>
+          <w:color w:val="4664BE"/>
+          <w:szCs w:val="21"/>
+        </w:rPr>
+      </w:pPr>
+      <w:r>
+        <w:rPr>
+          <w:rFonts w:asciiTheme="minorHAnsi" w:hAnsiTheme="minorHAnsi"/>
           <w:b w:val="0"/>
-          <w:color w:val="FFFFFF" w:themeColor="background1"/>
+          <w:color w:val="000000" w:themeColor="text1"/>
         </w:rPr>
         <w:t>e) Foram padronizados os títulos, a hierarquia de cabeçalhos (um h1 por página) e os dados fictícios de contato em todas as páginas.</w:t>
       </w:r>
       <w:r>
         <w:rPr>
-          <w:rStyle w:val="normaltextrun"/>
-          <w:rFonts w:asciiTheme="majorHAnsi" w:hAnsiTheme="majorHAnsi" w:cstheme="majorHAnsi"/>
-          <w:b/>
-          <w:color w:val="FFFFFF" w:themeColor="background1"/>
-        </w:rPr>
-      </w:r>
-      <w:r>
-        <w:rPr>
-          <w:rStyle w:val="normaltextrun"/>
-          <w:rFonts w:asciiTheme="majorHAnsi" w:hAnsiTheme="majorHAnsi" w:cstheme="majorHAnsi"/>
-          <w:b/>
-          <w:color w:val="FFFFFF" w:themeColor="background1"/>
-        </w:rPr>
-      </w:r>
-    </w:p>
-    <w:p>
-      <w:pPr>
-        <w:shd w:val="clear" w:color="auto" w:fill="32966E"/>
+          <w:rFonts w:asciiTheme="minorHAnsi" w:hAnsiTheme="minorHAnsi"/>
+          <w:color w:val="000000" w:themeColor="text1"/>
+        </w:rPr>
+      </w:r>
+    </w:p>
+    <w:p>
+      <w:pPr>
         <w:spacing w:after="0" w:line="240" w:lineRule="auto"/>
         <w:jc w:val="both"/>
         <w:rPr>
           <w:rFonts w:asciiTheme="minorHAnsi" w:hAnsiTheme="minorHAnsi" w:cstheme="minorHAnsi"/>
           <w:b/>
           <w:bCs/>
-          <w:color w:val="FFFFFF" w:themeColor="background1"/>
-          <w:spacing w:val="-2"/>
-          <w:sz w:val="20"/>
-          <w:szCs w:val="20"/>
-        </w:rPr>
-      </w:pPr>
-      <w:r>
-        <w:rPr>
-          <w:rStyle w:val="normaltextrun"/>
-          <w:rFonts w:asciiTheme="majorHAnsi" w:hAnsiTheme="majorHAnsi" w:cstheme="majorHAnsi"/>
+          <w:color w:val="4664BE"/>
+          <w:szCs w:val="21"/>
+        </w:rPr>
+      </w:pPr>
+      <w:r>
+        <w:rPr>
+          <w:rFonts w:asciiTheme="minorHAnsi" w:hAnsiTheme="minorHAnsi"/>
           <w:b w:val="0"/>
-          <w:color w:val="FFFFFF" w:themeColor="background1"/>
+          <w:color w:val="000000" w:themeColor="text1"/>
         </w:rPr>
         <w:t>f) Os arquivos do Bootstrap foram copiados para dentro do projeto, de modo que o site continua funcionando mesmo sem acesso a servidores externos.</w:t>
       </w:r>
       <w:r>
         <w:rPr>
-          <w:rStyle w:val="normaltextrun"/>
-          <w:rFonts w:asciiTheme="majorHAnsi" w:hAnsiTheme="majorHAnsi" w:cstheme="majorHAnsi"/>
-          <w:b/>
-          <w:color w:val="FFFFFF" w:themeColor="background1"/>
-        </w:rPr>
-      </w:r>
-      <w:r>
-        <w:rPr>
-          <w:rStyle w:val="normaltextrun"/>
-          <w:rFonts w:asciiTheme="majorHAnsi" w:hAnsiTheme="majorHAnsi" w:cstheme="majorHAnsi"/>
-          <w:b/>
-          <w:color w:val="FFFFFF" w:themeColor="background1"/>
-        </w:rPr>
-      </w:r>
-    </w:p>
-    <w:p>
-      <w:pPr>
-        <w:shd w:val="clear" w:color="auto" w:fill="32966E"/>
+          <w:rFonts w:asciiTheme="minorHAnsi" w:hAnsiTheme="minorHAnsi"/>
+          <w:color w:val="000000" w:themeColor="text1"/>
+        </w:rPr>
+      </w:r>
+    </w:p>
+    <w:p>
+      <w:pPr>
         <w:spacing w:after="0" w:line="240" w:lineRule="auto"/>
         <w:jc w:val="both"/>
         <w:rPr>
           <w:rFonts w:asciiTheme="minorHAnsi" w:hAnsiTheme="minorHAnsi" w:cstheme="minorHAnsi"/>
           <w:b/>
           <w:bCs/>
-          <w:color w:val="FFFFFF" w:themeColor="background1"/>
-          <w:spacing w:val="-2"/>
-          <w:sz w:val="20"/>
-          <w:szCs w:val="20"/>
-        </w:rPr>
-      </w:pPr>
-      <w:r>
-        <w:rPr>
-          <w:rStyle w:val="normaltextrun"/>
-          <w:rFonts w:asciiTheme="majorHAnsi" w:hAnsiTheme="majorHAnsi" w:cstheme="majorHAnsi"/>
+          <w:color w:val="4664BE"/>
+          <w:szCs w:val="21"/>
+        </w:rPr>
+      </w:pPr>
+      <w:r>
+        <w:rPr>
+          <w:rFonts w:asciiTheme="minorHAnsi" w:hAnsiTheme="minorHAnsi"/>
           <w:b w:val="0"/>
-          <w:color w:val="FFFFFF" w:themeColor="background1"/>
-        </w:rPr>
-        <w:t>g) A página de ajuda foi ampliada e passou a descrever as funcionalidades, os ajustes desta fase, os recursos de acessibilidade, os créditos das imagens e a política de privacidade.</w:t>
-      </w:r>
-      <w:r>
-        <w:rPr>
-          <w:rStyle w:val="normaltextrun"/>
-          <w:rFonts w:asciiTheme="majorHAnsi" w:hAnsiTheme="majorHAnsi" w:cstheme="majorHAnsi"/>
-          <w:b/>
-          <w:color w:val="FFFFFF" w:themeColor="background1"/>
-        </w:rPr>
-      </w:r>
-      <w:r>
-        <w:rPr>
-          <w:rStyle w:val="normaltextrun"/>
-          <w:rFonts w:asciiTheme="majorHAnsi" w:hAnsiTheme="majorHAnsi" w:cstheme="majorHAnsi"/>
-          <w:b/>
-          <w:color w:val="FFFFFF" w:themeColor="background1"/>
-        </w:rPr>
-      </w:r>
-    </w:p>
-    <w:p>
-      <w:pPr>
-        <w:shd w:val="clear" w:color="auto" w:fill="32966E"/>
+          <w:color w:val="000000" w:themeColor="text1"/>
+        </w:rPr>
+        <w:t>g) O carrossel foi ajustado para telas largas: a foto aparece inteira sobre um fundo desfocado, com largura e altura máximas, evitando cortes na imagem.</w:t>
+      </w:r>
+      <w:r>
+        <w:rPr>
+          <w:rFonts w:asciiTheme="minorHAnsi" w:hAnsiTheme="minorHAnsi"/>
+          <w:color w:val="000000" w:themeColor="text1"/>
+        </w:rPr>
+      </w:r>
+    </w:p>
+    <w:p>
+      <w:pPr>
         <w:spacing w:after="0" w:line="240" w:lineRule="auto"/>
         <w:jc w:val="both"/>
         <w:rPr>
           <w:rFonts w:asciiTheme="minorHAnsi" w:hAnsiTheme="minorHAnsi" w:cstheme="minorHAnsi"/>
           <w:b/>
           <w:bCs/>
-          <w:color w:val="FFFFFF" w:themeColor="background1"/>
-          <w:spacing w:val="-2"/>
-          <w:sz w:val="20"/>
-          <w:szCs w:val="20"/>
-        </w:rPr>
-      </w:pPr>
-      <w:r>
-        <w:rPr>
-          <w:rStyle w:val="normaltextrun"/>
-          <w:rFonts w:asciiTheme="majorHAnsi" w:hAnsiTheme="majorHAnsi" w:cstheme="majorHAnsi"/>
-          <w:b/>
-          <w:color w:val="FFFFFF" w:themeColor="background1"/>
-        </w:rPr>
-        <w:t>Observação sobre a hospedagem</w:t>
-      </w:r>
-      <w:r>
-        <w:rPr>
-          <w:rStyle w:val="normaltextrun"/>
-          <w:rFonts w:asciiTheme="majorHAnsi" w:hAnsiTheme="majorHAnsi" w:cstheme="majorHAnsi"/>
-          <w:b/>
-          <w:color w:val="FFFFFF" w:themeColor="background1"/>
-        </w:rPr>
-      </w:r>
-      <w:r>
-        <w:rPr>
-          <w:rStyle w:val="normaltextrun"/>
-          <w:rFonts w:asciiTheme="majorHAnsi" w:hAnsiTheme="majorHAnsi" w:cstheme="majorHAnsi"/>
-          <w:b/>
-          <w:color w:val="FFFFFF" w:themeColor="background1"/>
-        </w:rPr>
-      </w:r>
-    </w:p>
-    <w:p>
-      <w:pPr>
-        <w:shd w:val="clear" w:color="auto" w:fill="32966E"/>
+          <w:color w:val="4664BE"/>
+          <w:szCs w:val="21"/>
+        </w:rPr>
+      </w:pPr>
+      <w:r>
+        <w:rPr>
+          <w:rFonts w:asciiTheme="minorHAnsi" w:hAnsiTheme="minorHAnsi"/>
+          <w:b w:val="0"/>
+          <w:color w:val="000000" w:themeColor="text1"/>
+        </w:rPr>
+        <w:t>h) A página de ajuda foi ampliada e passou a descrever as funcionalidades, os ajustes desta fase, os recursos de acessibilidade, os créditos das imagens e a política de privacidade.</w:t>
+      </w:r>
+      <w:r>
+        <w:rPr>
+          <w:rFonts w:asciiTheme="minorHAnsi" w:hAnsiTheme="minorHAnsi"/>
+          <w:color w:val="000000" w:themeColor="text1"/>
+        </w:rPr>
+      </w:r>
+    </w:p>
+    <w:p>
+      <w:pPr>
         <w:spacing w:after="0" w:line="240" w:lineRule="auto"/>
         <w:jc w:val="both"/>
         <w:rPr>
           <w:rFonts w:asciiTheme="minorHAnsi" w:hAnsiTheme="minorHAnsi" w:cstheme="minorHAnsi"/>
           <w:b/>
           <w:bCs/>
-          <w:color w:val="FFFFFF" w:themeColor="background1"/>
-          <w:spacing w:val="-2"/>
-          <w:sz w:val="20"/>
-          <w:szCs w:val="20"/>
-        </w:rPr>
-      </w:pPr>
-      <w:r>
-        <w:rPr>
-          <w:rStyle w:val="normaltextrun"/>
-          <w:rFonts w:asciiTheme="majorHAnsi" w:hAnsiTheme="majorHAnsi" w:cstheme="majorHAnsi"/>
+          <w:color w:val="4664BE"/>
+          <w:szCs w:val="21"/>
+        </w:rPr>
+      </w:pPr>
+      <w:r>
+        <w:rPr>
+          <w:rFonts w:asciiTheme="minorHAnsi" w:hAnsiTheme="minorHAnsi"/>
+          <w:b/>
+          <w:color w:val="000000" w:themeColor="text1"/>
+        </w:rPr>
+        <w:t>Observação sobre a hospedagem</w:t>
+      </w:r>
+      <w:r>
+        <w:rPr>
+          <w:rFonts w:asciiTheme="minorHAnsi" w:hAnsiTheme="minorHAnsi"/>
+          <w:color w:val="000000" w:themeColor="text1"/>
+        </w:rPr>
+      </w:r>
+    </w:p>
+    <w:p>
+      <w:pPr>
+        <w:spacing w:after="0" w:line="240" w:lineRule="auto"/>
+        <w:jc w:val="both"/>
+        <w:rPr>
+          <w:rFonts w:asciiTheme="minorHAnsi" w:hAnsiTheme="minorHAnsi" w:cstheme="minorHAnsi"/>
+          <w:b/>
+          <w:bCs/>
+          <w:color w:val="4664BE"/>
+          <w:szCs w:val="21"/>
+        </w:rPr>
+      </w:pPr>
+      <w:r>
+        <w:rPr>
+          <w:rFonts w:asciiTheme="minorHAnsi" w:hAnsiTheme="minorHAnsi"/>
           <w:b w:val="0"/>
-          <w:color w:val="FFFFFF" w:themeColor="background1"/>
+          <w:color w:val="000000" w:themeColor="text1"/>
         </w:rPr>
         <w:t>Conforme permite o enunciado (“GitHub Pages ou similar”), o site está publicado no Cloudflare Workers com Static Assets, serviço equivalente de hospedagem de páginas estáticas a partir do repositório do GitHub.</w:t>
       </w:r>
       <w:r>
         <w:rPr>
-          <w:rStyle w:val="normaltextrun"/>
-          <w:rFonts w:asciiTheme="majorHAnsi" w:hAnsiTheme="majorHAnsi" w:cstheme="majorHAnsi"/>
-          <w:b/>
-          <w:color w:val="FFFFFF" w:themeColor="background1"/>
-        </w:rPr>
-      </w:r>
-      <w:r>
-        <w:rPr>
-          <w:rStyle w:val="normaltextrun"/>
-          <w:rFonts w:asciiTheme="majorHAnsi" w:hAnsiTheme="majorHAnsi" w:cstheme="majorHAnsi"/>
-          <w:b/>
-          <w:color w:val="FFFFFF" w:themeColor="background1"/>
+          <w:rFonts w:asciiTheme="minorHAnsi" w:hAnsiTheme="minorHAnsi"/>
+          <w:color w:val="000000" w:themeColor="text1"/>
         </w:rPr>
       </w:r>
     </w:p>
@@ -1098,7 +831,7 @@
           <w:rFonts w:asciiTheme="minorHAnsi" w:hAnsiTheme="minorHAnsi"/>
           <w:color w:val="000000" w:themeColor="text1"/>
         </w:rPr>
-        <w:t>https://pata-amiga-petshop.tecwolf.workers.dev</w:t>
+        <w:t>https://pataamigapetshop.wilssola.dev</w:t>
       </w:r>
       <w:r>
         <w:rPr>

</xml_diff>